<commit_message>
guide codage v1.2 : alignement antiseche v15.2 (DH rose 20% acte + note conventionnelle, APC non confirme, bloc USC, TAP x2 ecarte)
</commit_message>
<xml_diff>
--- a/docs/module-liberal/Guide_aide_au_codage_CHPG.docx
+++ b/docs/module-liberal/Guide_aide_au_codage_CHPG.docx
@@ -68,7 +68,7 @@
           <w:sz w:val="18"/>
           <w:szCs w:val="18"/>
         </w:rPr>
-        <w:t xml:space="preserve">v1.1 — 18 juillet 2026</w:t>
+        <w:t xml:space="preserve">v1.2 — 19 juillet 2026</w:t>
       </w:r>
       <w:r>
         <w:rPr>
@@ -77,7 +77,7 @@
           <w:sz w:val="18"/>
           <w:szCs w:val="18"/>
         </w:rPr>
-        <w:t xml:space="preserve">   ·   fusionne l’antisèche v14, la fiche mémo et le mémo 1 page — validé au centime sur feuilles réelles</w:t>
+        <w:t xml:space="preserve">   ·   aligné sur l’antisèche v15.2 (confrontée à l’addendum conventionnel du 01/10/2025) — validé au centime sur feuilles réelles</w:t>
       </w:r>
     </w:p>
     <w:p>
@@ -2884,7 +2884,7 @@
                 <w:sz w:val="19"/>
                 <w:szCs w:val="19"/>
               </w:rPr>
-              <w:t xml:space="preserve">APC</w:t>
+              <w:t xml:space="preserve">APC ❓</w:t>
             </w:r>
           </w:p>
         </w:tc>
@@ -2911,7 +2911,7 @@
                 <w:sz w:val="19"/>
                 <w:szCs w:val="19"/>
               </w:rPr>
-              <w:t xml:space="preserve">60,00 €</w:t>
+              <w:t xml:space="preserve">60,00 € (observé)</w:t>
             </w:r>
           </w:p>
         </w:tc>
@@ -2938,7 +2938,7 @@
                 <w:sz w:val="19"/>
                 <w:szCs w:val="19"/>
               </w:rPr>
-              <w:t xml:space="preserve">APC 1 → 60,00 € · avis ponctuel de consultant (coeff. 1 supposé, à confirmer)</w:t>
+              <w:t xml:space="preserve">absent du tableau conventionnel publié (Annexe III, 01/10/2025) — à confirmer CSM, cf. §8</w:t>
             </w:r>
           </w:p>
         </w:tc>
@@ -3270,7 +3270,7 @@
                 <w:sz w:val="19"/>
                 <w:szCs w:val="19"/>
               </w:rPr>
-              <w:t xml:space="preserve">+ 20 % de la BR</w:t>
+              <w:t xml:space="preserve">+ 20 % de la BR (pratique CHPG actée)</w:t>
             </w:r>
           </w:p>
         </w:tc>
@@ -3576,6 +3576,54 @@
           <w:szCs w:val="20"/>
         </w:rPr>
         <w:t xml:space="preserve">HNP (« honoraires non perçus ») = modalité de perception via la Caisse (tiers payant), pas un statut de carte : aucun effet sur le calcul BR/DH.</w:t>
+      </w:r>
+    </w:p>
+    <w:p>
+      <w:pPr>
+        <w:pBdr>
+          <w:top w:val="single" w:color="0E6E6A" w:sz="4" w:space="6"/>
+          <w:bottom w:val="single" w:color="0E6E6A" w:sz="4" w:space="6"/>
+          <w:left w:val="single" w:color="0E6E6A" w:sz="22" w:space="9"/>
+          <w:right w:val="single" w:color="0E6E6A" w:sz="4" w:space="6"/>
+        </w:pBdr>
+        <w:shd w:fill="EFF5F5" w:color="auto" w:val="clear"/>
+        <w:spacing w:after="240" w:line="288"/>
+      </w:pPr>
+      <w:r>
+        <w:rPr>
+          <w:rFonts w:ascii="Calibri" w:cs="Calibri" w:eastAsia="Calibri" w:hAnsi="Calibri"/>
+          <w:b/>
+          <w:bCs/>
+          <w:sz w:val="20"/>
+          <w:szCs w:val="20"/>
+        </w:rPr>
+        <w:t xml:space="preserve">Cadre conventionnel (addendum du 01/10/2025).  </w:t>
+      </w:r>
+      <w:r>
+        <w:rPr>
+          <w:rFonts w:ascii="Calibri" w:cs="Calibri" w:eastAsia="Calibri" w:hAnsi="Calibri"/>
+          <w:sz w:val="20"/>
+          <w:szCs w:val="20"/>
+        </w:rPr>
+        <w:t xml:space="preserve">Coefficient maximal carte rose en CCAM : 241 % contre une BR à 195 %, soit un plafond de DH à +23,59 % de la BR. La pratique CHPG reste à </w:t>
+      </w:r>
+      <w:r>
+        <w:rPr>
+          <w:rFonts w:ascii="Calibri" w:cs="Calibri" w:eastAsia="Calibri" w:hAnsi="Calibri"/>
+          <w:b/>
+          <w:bCs/>
+          <w:sz w:val="20"/>
+          <w:szCs w:val="20"/>
+        </w:rPr>
+        <w:t xml:space="preserve">+20 %</w:t>
+      </w:r>
+      <w:r>
+        <w:rPr>
+          <w:rFonts w:ascii="Calibri" w:cs="Calibri" w:eastAsia="Calibri" w:hAnsi="Calibri"/>
+          <w:sz w:val="20"/>
+          <w:szCs w:val="20"/>
+        </w:rPr>
+        <w:t xml:space="preserve"> (décision du 19/07/2026) ; l’écart n’est pas expliqué et ne doit pas être lu comme une marge à récupérer. En NGAP, le +20 % rose est le plafond légal. Seuil de l’article 14 (HNP rose/bulle) : 177,45 €.</w:t>
       </w:r>
     </w:p>
     <w:p>
@@ -4150,6 +4198,52 @@
     </w:p>
     <w:p>
       <w:pPr>
+        <w:pStyle w:val="ListParagraph"/>
+        <w:numPr>
+          <w:ilvl w:val="0"/>
+          <w:numId w:val="2"/>
+        </w:numPr>
+        <w:spacing w:after="105" w:line="288"/>
+      </w:pPr>
+      <w:r>
+        <w:rPr>
+          <w:rFonts w:ascii="Calibri" w:cs="Calibri" w:eastAsia="Calibri" w:hAnsi="Calibri"/>
+          <w:b/>
+          <w:bCs/>
+          <w:sz w:val="20"/>
+          <w:szCs w:val="20"/>
+        </w:rPr>
+        <w:t xml:space="preserve">USC / lit scopé</w:t>
+      </w:r>
+      <w:r>
+        <w:rPr>
+          <w:rFonts w:ascii="Calibri" w:cs="Calibri" w:eastAsia="Calibri" w:hAnsi="Calibri"/>
+          <w:sz w:val="20"/>
+          <w:szCs w:val="20"/>
+        </w:rPr>
+        <w:t xml:space="preserve"> : en général le forfait </w:t>
+      </w:r>
+      <w:r>
+        <w:rPr>
+          <w:rFonts w:ascii="Calibri" w:cs="Calibri" w:eastAsia="Calibri" w:hAnsi="Calibri"/>
+          <w:b/>
+          <w:bCs/>
+          <w:sz w:val="20"/>
+          <w:szCs w:val="20"/>
+        </w:rPr>
+        <w:t xml:space="preserve">niveau A</w:t>
+      </w:r>
+      <w:r>
+        <w:rPr>
+          <w:rFonts w:ascii="Calibri" w:cs="Calibri" w:eastAsia="Calibri" w:hAnsi="Calibri"/>
+          <w:sz w:val="20"/>
+          <w:szCs w:val="20"/>
+        </w:rPr>
+        <w:t xml:space="preserve"> (la suppléance qui débloque le B y est rare — ne pas coter B par réflexe de gravité). L’exclusion VVC / transfusion le même jour s’étend à l’USC. DEQP007 (ECG) : statut non tranché — risque de rejet si inclus, à confirmer CSM avant usage.</w:t>
+      </w:r>
+    </w:p>
+    <w:p>
+      <w:pPr>
         <w:spacing w:after="60"/>
       </w:pPr>
     </w:p>
@@ -5125,7 +5219,7 @@
                 <w:sz w:val="19"/>
                 <w:szCs w:val="19"/>
               </w:rPr>
-              <w:t xml:space="preserve">USC</w:t>
+              <w:t xml:space="preserve">USC — DEQP007</w:t>
             </w:r>
           </w:p>
         </w:tc>
@@ -5153,7 +5247,7 @@
                 <w:sz w:val="19"/>
                 <w:szCs w:val="19"/>
               </w:rPr>
-              <w:t xml:space="preserve">non documenté</w:t>
+              <w:t xml:space="preserve">niveau A par défaut · exclusions étendues (acté)</w:t>
             </w:r>
           </w:p>
         </w:tc>
@@ -5181,7 +5275,7 @@
                 <w:sz w:val="19"/>
                 <w:szCs w:val="19"/>
               </w:rPr>
-              <w:t xml:space="preserve">YYYY015 + DEQP007 · VVC et transfusion exclues le même jour</w:t>
+              <w:t xml:space="preserve">seul point ouvert : DEQP007 en sus du forfait ? (risque de rejet si inclus)</w:t>
             </w:r>
           </w:p>
         </w:tc>
@@ -5210,7 +5304,7 @@
                 <w:sz w:val="19"/>
                 <w:szCs w:val="19"/>
               </w:rPr>
-              <w:t xml:space="preserve">TAP bilatéral</w:t>
+              <w:t xml:space="preserve">Redevance hôpital</w:t>
             </w:r>
           </w:p>
         </w:tc>
@@ -5237,7 +5331,7 @@
                 <w:sz w:val="19"/>
                 <w:szCs w:val="19"/>
               </w:rPr>
-              <w:t xml:space="preserve">AHQJ021 × 1</w:t>
+              <w:t xml:space="preserve">—</w:t>
             </w:r>
           </w:p>
         </w:tc>
@@ -5264,7 +5358,7 @@
                 <w:sz w:val="19"/>
                 <w:szCs w:val="19"/>
               </w:rPr>
-              <w:t xml:space="preserve">× 2 si deux codes chirurgicaux (à vérifier)</w:t>
+              <w:t xml:space="preserve">taux et assiette du reversement à préciser (administration)</w:t>
             </w:r>
           </w:p>
         </w:tc>
@@ -5294,7 +5388,7 @@
                 <w:sz w:val="19"/>
                 <w:szCs w:val="19"/>
               </w:rPr>
-              <w:t xml:space="preserve">Redevance hôpital</w:t>
+              <w:t xml:space="preserve">TAP bilatéral</w:t>
             </w:r>
           </w:p>
         </w:tc>
@@ -5322,7 +5416,7 @@
                 <w:sz w:val="19"/>
                 <w:szCs w:val="19"/>
               </w:rPr>
-              <w:t xml:space="preserve">—</w:t>
+              <w:t xml:space="preserve">AHQJ021 × 1</w:t>
             </w:r>
           </w:p>
         </w:tc>
@@ -5350,7 +5444,7 @@
                 <w:sz w:val="19"/>
                 <w:szCs w:val="19"/>
               </w:rPr>
-              <w:t xml:space="preserve">taux et assiette du reversement à préciser (administration)</w:t>
+              <w:t xml:space="preserve">écarté le 19/07/2026 — un seul AHQJ021 par intervention, question close</w:t>
             </w:r>
           </w:p>
         </w:tc>
@@ -5445,7 +5539,7 @@
           <w:sz w:val="20"/>
           <w:szCs w:val="20"/>
         </w:rPr>
-        <w:t xml:space="preserve">Convention CCSS-CAMTI / Ordre des Médecins de Monaco — coefficients par carte.</w:t>
+        <w:t xml:space="preserve">Convention CCSS-CAMTI / Ordre des Médecins de Monaco du 01/04/2023 (→ 31/03/2028) et addendum Annexe III/IV du 02/09/2025 (effet 01/10/2025) — lettres-clés NGAP, coefficients par carte (verte 195 % · rose 241 %), seuil art. 14. Valeurs datées : à reconfronter à chaque addendum.</w:t>
       </w:r>
     </w:p>
     <w:p>
@@ -5555,7 +5649,7 @@
         <w:sz w:val="15"/>
         <w:szCs w:val="15"/>
       </w:rPr>
-      <w:t xml:space="preserve">Guide d’aide au codage · CHPG Anesthésie-Réanimation · v1.1 · p. </w:t>
+      <w:t xml:space="preserve">Guide d’aide au codage · CHPG Anesthésie-Réanimation · v1.2 · p. </w:t>
       <w:fldChar w:fldCharType="begin"/>
       <w:instrText xml:space="preserve">PAGE</w:instrText>
       <w:fldChar w:fldCharType="separate"/>

</xml_diff>

<commit_message>
guide codage v1.3 : APC deux voies (etages + CPA ASA>=3 art.18B), sources enrichies en fin de document
</commit_message>
<xml_diff>
--- a/docs/module-liberal/Guide_aide_au_codage_CHPG.docx
+++ b/docs/module-liberal/Guide_aide_au_codage_CHPG.docx
@@ -68,7 +68,7 @@
           <w:sz w:val="18"/>
           <w:szCs w:val="18"/>
         </w:rPr>
-        <w:t xml:space="preserve">v1.2 — 19 juillet 2026</w:t>
+        <w:t xml:space="preserve">v1.3 — 19 juillet 2026</w:t>
       </w:r>
       <w:r>
         <w:rPr>
@@ -2884,7 +2884,7 @@
                 <w:sz w:val="19"/>
                 <w:szCs w:val="19"/>
               </w:rPr>
-              <w:t xml:space="preserve">APC ❓</w:t>
+              <w:t xml:space="preserve">APC</w:t>
             </w:r>
           </w:p>
         </w:tc>
@@ -2911,7 +2911,7 @@
                 <w:sz w:val="19"/>
                 <w:szCs w:val="19"/>
               </w:rPr>
-              <w:t xml:space="preserve">60,00 € (observé)</w:t>
+              <w:t xml:space="preserve">60,00 € (tarif français en vigueur)</w:t>
             </w:r>
           </w:p>
         </w:tc>
@@ -2938,7 +2938,7 @@
                 <w:sz w:val="19"/>
                 <w:szCs w:val="19"/>
               </w:rPr>
-              <w:t xml:space="preserve">absent du tableau conventionnel publié (Annexe III, 01/10/2025) — à confirmer CSM, cf. §8</w:t>
+              <w:t xml:space="preserve">deux voies : avis étages hors chirurgie programmée · CPA si ASA ≥ 3 (art. 18B) — détail ci-dessous</w:t>
             </w:r>
           </w:p>
         </w:tc>
@@ -2968,15 +2968,78 @@
           <w:sz w:val="20"/>
           <w:szCs w:val="20"/>
         </w:rPr>
-        <w:t xml:space="preserve">Pas de consultation (APC ou CS) le jour même d’un acte anesthésique — sauf urgence</w:t>
-      </w:r>
-      <w:r>
-        <w:rPr>
-          <w:rFonts w:ascii="Calibri" w:cs="Calibri" w:eastAsia="Calibri" w:hAnsi="Calibri"/>
-          <w:sz w:val="20"/>
-          <w:szCs w:val="20"/>
-        </w:rPr>
-        <w:t xml:space="preserve"> (art. 20 A). Les axes CCAM et NGAP sont deux mondes séparés : formules, modificateurs et quotas ne se croisent jamais.</w:t>
+        <w:t xml:space="preserve">Pas de consultation (APC ou CS) le jour même d’un acte anesthésique — sauf urgence (art. 20 A).</w:t>
+      </w:r>
+    </w:p>
+    <w:p>
+      <w:pPr>
+        <w:pBdr>
+          <w:top w:val="single" w:color="0E6E6A" w:sz="4" w:space="6"/>
+          <w:bottom w:val="single" w:color="0E6E6A" w:sz="4" w:space="6"/>
+          <w:left w:val="single" w:color="0E6E6A" w:sz="22" w:space="9"/>
+          <w:right w:val="single" w:color="0E6E6A" w:sz="4" w:space="6"/>
+        </w:pBdr>
+        <w:shd w:fill="EFF5F5" w:color="auto" w:val="clear"/>
+        <w:spacing w:after="240" w:line="288"/>
+      </w:pPr>
+      <w:r>
+        <w:rPr>
+          <w:rFonts w:ascii="Calibri" w:cs="Calibri" w:eastAsia="Calibri" w:hAnsi="Calibri"/>
+          <w:b/>
+          <w:bCs/>
+          <w:sz w:val="20"/>
+          <w:szCs w:val="20"/>
+        </w:rPr>
+        <w:t xml:space="preserve">APC — les deux voies (v1.3).  </w:t>
+      </w:r>
+      <w:r>
+        <w:rPr>
+          <w:rFonts w:ascii="Calibri" w:cs="Calibri" w:eastAsia="Calibri" w:hAnsi="Calibri"/>
+          <w:sz w:val="20"/>
+          <w:szCs w:val="20"/>
+        </w:rPr>
+        <w:t xml:space="preserve">① Avis ponctuel dans les étages, hors chirurgie programmée (patient adressé, CR au demandeur, ASA indifférent). ② CPA d’un patient </w:t>
+      </w:r>
+      <w:r>
+        <w:rPr>
+          <w:rFonts w:ascii="Calibri" w:cs="Calibri" w:eastAsia="Calibri" w:hAnsi="Calibri"/>
+          <w:b/>
+          <w:bCs/>
+          <w:sz w:val="20"/>
+          <w:szCs w:val="20"/>
+        </w:rPr>
+        <w:t xml:space="preserve">ASA ≥ 3</w:t>
+      </w:r>
+      <w:r>
+        <w:rPr>
+          <w:rFonts w:ascii="Calibri" w:cs="Calibri" w:eastAsia="Calibri" w:hAnsi="Calibri"/>
+          <w:sz w:val="20"/>
+          <w:szCs w:val="20"/>
+        </w:rPr>
+        <w:t xml:space="preserve"> (dérogation anesthésiste, art. 18B NGAP) : éléments ASA documentés au dossier, CR écrit au MAR opérateur + à l’opérateur + au médecin traitant, non-cumul surveillance/CCAM hors acte d’anesthésie. Ouvre aussi la 1ʳᵉ consultation en urgence non programmée avec hospitalisation. Une CPA ASA 1-2 reste une CS (46 €). Réserve : transposition monégasque à confirmer CSM (APC absente de l’Annexe III).</w:t>
+      </w:r>
+    </w:p>
+    <w:p>
+      <w:pPr>
+        <w:spacing w:after="120" w:line="288"/>
+        <w:ind w:left="170"/>
+      </w:pPr>
+      <w:r>
+        <w:rPr>
+          <w:rFonts w:ascii="Calibri" w:cs="Calibri" w:eastAsia="Calibri" w:hAnsi="Calibri"/>
+          <w:color w:val="0E6E6A"/>
+          <w:sz w:val="23"/>
+          <w:szCs w:val="23"/>
+        </w:rPr>
+        <w:t xml:space="preserve">☐  </w:t>
+      </w:r>
+      <w:r>
+        <w:rPr>
+          <w:rFonts w:ascii="Calibri" w:cs="Calibri" w:eastAsia="Calibri" w:hAnsi="Calibri"/>
+          <w:sz w:val="20"/>
+          <w:szCs w:val="20"/>
+        </w:rPr>
+        <w:t xml:space="preserve">Les axes CCAM et NGAP sont deux mondes séparés : formules, modificateurs et quotas ne se croisent jamais.</w:t>
       </w:r>
     </w:p>
     <w:p>
@@ -5078,7 +5141,7 @@
                 <w:sz w:val="19"/>
                 <w:szCs w:val="19"/>
               </w:rPr>
-              <w:t xml:space="preserve">APC = avis ponctuel de consultant</w:t>
+              <w:t xml:space="preserve">deux voies actées : avis étages + CPA ASA ≥ 3 (art. 18B)</w:t>
             </w:r>
           </w:p>
         </w:tc>
@@ -5106,7 +5169,7 @@
                 <w:sz w:val="19"/>
                 <w:szCs w:val="19"/>
               </w:rPr>
-              <w:t xml:space="preserve">APC si ASA ≥ 3 · CS + MCS si ASA 1-2</w:t>
+              <w:t xml:space="preserve">résolu (19/07/2026) — reste la transposition monégasque à confirmer</w:t>
             </w:r>
           </w:p>
         </w:tc>
@@ -5522,6 +5585,60 @@
           <w:szCs w:val="20"/>
         </w:rPr>
         <w:t xml:space="preserve">Base CCAM v80 (01/01/2025, ameli / ATIH) — tarifs unitaires activités 1 et 4.</w:t>
+      </w:r>
+    </w:p>
+    <w:p>
+      <w:pPr>
+        <w:pStyle w:val="ListParagraph"/>
+        <w:numPr>
+          <w:ilvl w:val="0"/>
+          <w:numId w:val="2"/>
+        </w:numPr>
+        <w:spacing w:after="105" w:line="288"/>
+      </w:pPr>
+      <w:r>
+        <w:rPr>
+          <w:rFonts w:ascii="Calibri" w:cs="Calibri" w:eastAsia="Calibri" w:hAnsi="Calibri"/>
+          <w:sz w:val="20"/>
+          <w:szCs w:val="20"/>
+        </w:rPr>
+        <w:t xml:space="preserve">NGAP française art. 18B + dérogation anesthésiste CPA ASA ≥ 3 (décision UNCAM du 03/10/2019 · avenant 6 · convention médicale 2024-2026) — tarif APC en vigueur 60 €. Transposition monégasque non prouvée (A.M. 84-688 antérieur).</w:t>
+      </w:r>
+    </w:p>
+    <w:p>
+      <w:pPr>
+        <w:pStyle w:val="ListParagraph"/>
+        <w:numPr>
+          <w:ilvl w:val="0"/>
+          <w:numId w:val="2"/>
+        </w:numPr>
+        <w:spacing w:after="105" w:line="288"/>
+      </w:pPr>
+      <w:r>
+        <w:rPr>
+          <w:rFonts w:ascii="Calibri" w:cs="Calibri" w:eastAsia="Calibri" w:hAnsi="Calibri"/>
+          <w:sz w:val="20"/>
+          <w:szCs w:val="20"/>
+        </w:rPr>
+        <w:t xml:space="preserve">A.M. 84-688 du 30/11/1984 (NGAP monégasque) · Ordonnance souveraine 5.743 du 03/03/2016 (AME monégasque).</w:t>
+      </w:r>
+    </w:p>
+    <w:p>
+      <w:pPr>
+        <w:pStyle w:val="ListParagraph"/>
+        <w:numPr>
+          <w:ilvl w:val="0"/>
+          <w:numId w:val="2"/>
+        </w:numPr>
+        <w:spacing w:after="105" w:line="288"/>
+      </w:pPr>
+      <w:r>
+        <w:rPr>
+          <w:rFonts w:ascii="Calibri" w:cs="Calibri" w:eastAsia="Calibri" w:hAnsi="Calibri"/>
+          <w:sz w:val="20"/>
+          <w:szCs w:val="20"/>
+        </w:rPr>
+        <w:t xml:space="preserve">Antisèche de cotation v15.3 et guide MAR « Comment fonctionne notre activité libérale » v0.3 — docs/module-liberal/ du portail.</w:t>
       </w:r>
     </w:p>
     <w:p>
@@ -5649,7 +5766,7 @@
         <w:sz w:val="15"/>
         <w:szCs w:val="15"/>
       </w:rPr>
-      <w:t xml:space="preserve">Guide d’aide au codage · CHPG Anesthésie-Réanimation · v1.2 · p. </w:t>
+      <w:t xml:space="preserve">Guide d’aide au codage · CHPG Anesthésie-Réanimation · v1.3 · p. </w:t>
       <w:fldChar w:fldCharType="begin"/>
       <w:instrText xml:space="preserve">PAGE</w:instrText>
       <w:fldChar w:fldCharType="separate"/>

</xml_diff>